<commit_message>
docs: add real-phone QR sign-in walkthrough and validation checklist
</commit_message>
<xml_diff>
--- a/docs/manual/Ako_User_Manual.docx
+++ b/docs/manual/Ako_User_Manual.docx
@@ -12,7 +12,7 @@
     </w:p>
     <w:p>
       <w:r>
-        <w:t>Version 1.0 | 27 October 2026 | English</w:t>
+        <w:t>Version 1.1 | 27 October 2026 | English</w:t>
       </w:r>
     </w:p>
     <w:p>
@@ -3753,6 +3753,1082 @@
       </w:r>
       <w:r>
         <w:t xml:space="preserve"> appears, stop retrying and ask staff. Learners without phones continue to use manual attendance.</w:t>
+      </w:r>
+    </w:p>
+    <w:p>
+      <w:pPr>
+        <w:pStyle w:val="Heading2"/>
+      </w:pPr>
+      <w:r>
+        <w:t>7.7 Verify QR sign-in step by step</w:t>
+      </w:r>
+    </w:p>
+    <w:p>
+      <w:r>
+        <w:t>Use this walkthrough to check US-011, US-012 and US-013 together on a real phone. Use a disposable demonstration dataset and a new, uniquely named test learner. These instructions are a test procedure, not a record that the checks passed.</w:t>
+      </w:r>
+    </w:p>
+    <w:p>
+      <w:r>
+        <w:rPr>
+          <w:b/>
+        </w:rPr>
+        <w:t>Step 1 Start the system</w:t>
+      </w:r>
+    </w:p>
+    <w:p>
+      <w:r>
+        <w:t>Start Docker Desktop or the Docker daemon. In the repository root, enter server. If server/.env does not exist, copy .env.example to .env before starting. Keep existing configuration and data volumes.</w:t>
+      </w:r>
+    </w:p>
+    <w:p>
+      <w:pPr>
+        <w:spacing w:after="0"/>
+      </w:pPr>
+      <w:r>
+        <w:rPr>
+          <w:rFonts w:ascii="Consolas" w:hAnsi="Consolas"/>
+          <w:sz w:val="18"/>
+        </w:rPr>
+        <w:t>cd server</w:t>
+      </w:r>
+    </w:p>
+    <w:p>
+      <w:pPr>
+        <w:spacing w:after="0"/>
+      </w:pPr>
+      <w:r>
+        <w:rPr>
+          <w:rFonts w:ascii="Consolas" w:hAnsi="Consolas"/>
+          <w:sz w:val="18"/>
+        </w:rPr>
+        <w:t>docker compose up -d --build</w:t>
+      </w:r>
+    </w:p>
+    <w:p>
+      <w:pPr>
+        <w:spacing w:after="0"/>
+      </w:pPr>
+      <w:r>
+        <w:rPr>
+          <w:rFonts w:ascii="Consolas" w:hAnsi="Consolas"/>
+          <w:sz w:val="18"/>
+        </w:rPr>
+        <w:t>docker compose ps</w:t>
+      </w:r>
+    </w:p>
+    <w:p>
+      <w:r>
+        <w:t>Open http://localhost:8080 on the computer. Wait for the services to become ready. For an unchanged local demonstration, the coordinator is demo / DemoPass123!. Otherwise use the configured account.</w:t>
+      </w:r>
+    </w:p>
+    <w:p>
+      <w:r>
+        <w:rPr>
+          <w:b/>
+        </w:rPr>
+        <w:t>Step 2 Make the address reachable from the phone</w:t>
+      </w:r>
+    </w:p>
+    <w:p>
+      <w:r>
+        <w:t>Connect the computer and phone to the same reachable Wi-Fi network. Find the computer's LAN IPv4 address in its active network settings. Replace 192.168.1.20 below with that actual address. Edit server/.env:</w:t>
+      </w:r>
+    </w:p>
+    <w:p>
+      <w:pPr>
+        <w:spacing w:after="0"/>
+      </w:pPr>
+      <w:r>
+        <w:rPr>
+          <w:rFonts w:ascii="Consolas" w:hAnsi="Consolas"/>
+          <w:sz w:val="18"/>
+        </w:rPr>
+        <w:t>AKO_BIND_ADDRESS=0.0.0.0</w:t>
+      </w:r>
+    </w:p>
+    <w:p>
+      <w:pPr>
+        <w:spacing w:after="0"/>
+      </w:pPr>
+      <w:r>
+        <w:rPr>
+          <w:rFonts w:ascii="Consolas" w:hAnsi="Consolas"/>
+          <w:sz w:val="18"/>
+        </w:rPr>
+        <w:t>CHECKIN_PUBLIC_ORIGIN=http://192.168.1.20:8080</w:t>
+      </w:r>
+    </w:p>
+    <w:p>
+      <w:pPr>
+        <w:spacing w:after="0"/>
+      </w:pPr>
+      <w:r>
+        <w:rPr>
+          <w:rFonts w:ascii="Consolas" w:hAnsi="Consolas"/>
+          <w:sz w:val="18"/>
+        </w:rPr>
+        <w:t>COOKIE_SECURE=false</w:t>
+      </w:r>
+    </w:p>
+    <w:p>
+      <w:r>
+        <w:t>This is an HTTP LAN demonstration configuration. Keep private INTERNAL_API_KEY and CHECKIN_TOKEN_SECRET values configured consistently through Compose. Do not overwrite existing database passwords or remove volumes.</w:t>
+      </w:r>
+    </w:p>
+    <w:p>
+      <w:r>
+        <w:t>From server, apply the settings:</w:t>
+      </w:r>
+    </w:p>
+    <w:p>
+      <w:pPr>
+        <w:spacing w:after="0"/>
+      </w:pPr>
+      <w:r>
+        <w:rPr>
+          <w:rFonts w:ascii="Consolas" w:hAnsi="Consolas"/>
+          <w:sz w:val="18"/>
+        </w:rPr>
+        <w:t>docker compose up -d --build</w:t>
+      </w:r>
+    </w:p>
+    <w:p>
+      <w:pPr>
+        <w:spacing w:after="0"/>
+      </w:pPr>
+      <w:r>
+        <w:rPr>
+          <w:rFonts w:ascii="Consolas" w:hAnsi="Consolas"/>
+          <w:sz w:val="18"/>
+        </w:rPr>
+        <w:t>docker compose restart nginx</w:t>
+      </w:r>
+    </w:p>
+    <w:p>
+      <w:r>
+        <w:t>On the phone, open http://192.168.1.20:8080/class-information. Continue only when it loads. If it fails, check the IP, inbound TCP 8080 firewall rule and Wi-Fi client isolation. A guest network can block communication. The QR link must use the reachable IP, not localhost or 0.0.0.0. Use HTTPS and the corresponding secure-cookie configuration for an HTTPS deployment.</w:t>
+      </w:r>
+    </w:p>
+    <w:p>
+      <w:r>
+        <w:rPr>
+          <w:b/>
+        </w:rPr>
+        <w:t>Step 3 Add a test learner</w:t>
+      </w:r>
+    </w:p>
+    <w:p>
+      <w:r>
+        <w:t>On the computer, log in and open Learners. Choose Add learner. Create First name Ana and Family name QRTest, or another unique test name. Check the list for an existing record before saving. Do not manually tick this learner Present: QR sign-in must create the first attendance.</w:t>
+      </w:r>
+    </w:p>
+    <w:p>
+      <w:r>
+        <w:rPr>
+          <w:b/>
+        </w:rPr>
+        <w:t>Step 4 Prepare a shared test file</w:t>
+      </w:r>
+    </w:p>
+    <w:p>
+      <w:r>
+        <w:t>Open Lessons &gt; New lesson. Enter a title, date and topic tag. Upload a small PDF and tick its Share with learners checkbox. For this basic check, leave Contains Māori content unticked. Choose Save lesson and confirm that the file is listed. Use a different lesson for cultural-review tests.</w:t>
+      </w:r>
+    </w:p>
+    <w:p>
+      <w:r>
+        <w:rPr>
+          <w:b/>
+        </w:rPr>
+        <w:t>Step 5 Open today's class and QR window</w:t>
+      </w:r>
+    </w:p>
+    <w:p>
+      <w:r>
+        <w:t>Choose Class sessions &gt; Start today's class. Check the date. Select the test lesson under Class lesson and choose Save lesson. Under QR check-in, choose Open check-in. Check that the code, sign-in link and expiry appear. The link must start with the LAN origin configured in Step 2. If today's session already has attendees, note the starting count instead of assuming zero. Keep the generated sign-in link available for the closure test.</w:t>
+      </w:r>
+    </w:p>
+    <w:p>
+      <w:r>
+        <w:rPr>
+          <w:b/>
+        </w:rPr>
+        <w:t>Step 6 Scan and sign in</w:t>
+      </w:r>
+    </w:p>
+    <w:p>
+      <w:r>
+        <w:t>Scan the displayed code with the phone camera. Open the link in the browser, check today's date and enter Ana / QRTest. Choose Sign in once. Expect You are signed in and the lesson materials area. No staff login, learner password or app should be required.</w:t>
+      </w:r>
+    </w:p>
+    <w:p>
+      <w:r>
+        <w:rPr>
+          <w:b/>
+        </w:rPr>
+        <w:t>Step 7 Confirm attendance on the computer</w:t>
+      </w:r>
+    </w:p>
+    <w:p>
+      <w:r>
+        <w:t>Open Attendance for that same class and find Ana QRTest. Allow approximately three seconds for automatic refresh. Expect Present, a recorded time and a count increase of one. It must appear within the ten-second acceptance window without manually ticking it. Confirm the learner is not recorded twice.</w:t>
+      </w:r>
+    </w:p>
+    <w:p>
+      <w:r>
+        <w:rPr>
+          <w:b/>
+        </w:rPr>
+        <w:t>Step 8 Download and revisit the materials</w:t>
+      </w:r>
+    </w:p>
+    <w:p>
+      <w:r>
+        <w:t>On the phone, choose Lesson materials and Download beside the test PDF. Verify the original filename and that the file opens. Return to /materials on the same origin and browser; the shared file should remain available. Do not switch between the LAN IP and localhost, clear cookies, or use a new private window. Those actions do not preserve the material-access cookie.</w:t>
+      </w:r>
+    </w:p>
+    <w:p>
+      <w:r>
+        <w:rPr>
+          <w:b/>
+        </w:rPr>
+        <w:t>Step 9 Check duplicate sign-in and closure</w:t>
+      </w:r>
+    </w:p>
+    <w:p>
+      <w:r>
+        <w:t>Reopen the original sign-in link and enter the same name. Expect Already signed in and no increase in attendance. Then choose Close check-in on the computer and reload the saved sign-in link. Expect Check-in is closed. Please ask the teacher, with no new attendance. Finally reopen /materials in the already authorized phone browser. Closing check-in should not revoke its existing 24-hour material access.</w:t>
+      </w:r>
+    </w:p>
+    <w:p>
+      <w:pPr>
+        <w:pStyle w:val="Heading2"/>
+      </w:pPr>
+      <w:r>
+        <w:t>7.8 Additional validation cases and results</w:t>
+      </w:r>
+    </w:p>
+    <w:p>
+      <w:r>
+        <w:t>Run each case with suitable fresh test learners and note the starting present count. Use a separate unsigned-in browser for access-denial checks. Reopen today's check-in and use its current code when the case needs an open window.</w:t>
+      </w:r>
+    </w:p>
+    <w:tbl>
+      <w:tblPr>
+        <w:tblW w:type="auto" w:w="0"/>
+        <w:tblLayout w:type="fixed"/>
+        <w:tblLook w:firstColumn="1" w:firstRow="1" w:lastColumn="0" w:lastRow="0" w:noHBand="0" w:noVBand="1" w:val="04A0"/>
+        <w:tblBorders>
+          <w:top w:val="single" w:sz="4" w:color="D9D9D9"/>
+          <w:left w:val="single" w:sz="4" w:color="D9D9D9"/>
+          <w:bottom w:val="single" w:sz="4" w:color="D9D9D9"/>
+          <w:right w:val="single" w:sz="4" w:color="D9D9D9"/>
+          <w:insideH w:val="single" w:sz="4" w:color="D9D9D9"/>
+          <w:insideV w:val="single" w:sz="4" w:color="D9D9D9"/>
+        </w:tblBorders>
+      </w:tblPr>
+      <w:tblGrid>
+        <w:gridCol w:w="1800"/>
+        <w:gridCol w:w="3312"/>
+        <w:gridCol w:w="4968"/>
+      </w:tblGrid>
+      <w:tr>
+        <w:trPr>
+          <w:cantSplit/>
+          <w:tblHeader/>
+        </w:trPr>
+        <w:tc>
+          <w:tcPr>
+            <w:tcW w:type="dxa" w:w="1800"/>
+            <w:vAlign w:val="center"/>
+            <w:tcMar>
+              <w:top w:w="80" w:type="dxa"/>
+              <w:left w:w="80" w:type="dxa"/>
+              <w:bottom w:w="80" w:type="dxa"/>
+              <w:right w:w="80" w:type="dxa"/>
+            </w:tcMar>
+            <w:shd w:fill="1F4E79"/>
+          </w:tcPr>
+          <w:p>
+            <w:pPr>
+              <w:spacing w:after="0"/>
+            </w:pPr>
+            <w:r>
+              <w:rPr>
+                <w:b/>
+                <w:color w:val="FFFFFF"/>
+                <w:sz w:val="20"/>
+              </w:rPr>
+              <w:t>Check</w:t>
+            </w:r>
+          </w:p>
+        </w:tc>
+        <w:tc>
+          <w:tcPr>
+            <w:tcW w:type="dxa" w:w="3312"/>
+            <w:vAlign w:val="center"/>
+            <w:tcMar>
+              <w:top w:w="80" w:type="dxa"/>
+              <w:left w:w="80" w:type="dxa"/>
+              <w:bottom w:w="80" w:type="dxa"/>
+              <w:right w:w="80" w:type="dxa"/>
+            </w:tcMar>
+            <w:shd w:fill="1F4E79"/>
+          </w:tcPr>
+          <w:p>
+            <w:pPr>
+              <w:spacing w:after="0"/>
+            </w:pPr>
+            <w:r>
+              <w:rPr>
+                <w:b/>
+                <w:color w:val="FFFFFF"/>
+                <w:sz w:val="20"/>
+              </w:rPr>
+              <w:t>Action</w:t>
+            </w:r>
+          </w:p>
+        </w:tc>
+        <w:tc>
+          <w:tcPr>
+            <w:tcW w:type="dxa" w:w="4968"/>
+            <w:vAlign w:val="center"/>
+            <w:tcMar>
+              <w:top w:w="80" w:type="dxa"/>
+              <w:left w:w="80" w:type="dxa"/>
+              <w:bottom w:w="80" w:type="dxa"/>
+              <w:right w:w="80" w:type="dxa"/>
+            </w:tcMar>
+            <w:shd w:fill="1F4E79"/>
+          </w:tcPr>
+          <w:p>
+            <w:pPr>
+              <w:spacing w:after="0"/>
+            </w:pPr>
+            <w:r>
+              <w:rPr>
+                <w:b/>
+                <w:color w:val="FFFFFF"/>
+                <w:sz w:val="20"/>
+              </w:rPr>
+              <w:t>Expected result</w:t>
+            </w:r>
+          </w:p>
+        </w:tc>
+      </w:tr>
+      <w:tr>
+        <w:trPr>
+          <w:cantSplit/>
+        </w:trPr>
+        <w:tc>
+          <w:tcPr>
+            <w:tcW w:type="dxa" w:w="1800"/>
+            <w:vAlign w:val="center"/>
+            <w:tcMar>
+              <w:top w:w="80" w:type="dxa"/>
+              <w:left w:w="80" w:type="dxa"/>
+              <w:bottom w:w="80" w:type="dxa"/>
+              <w:right w:w="80" w:type="dxa"/>
+            </w:tcMar>
+            <w:shd w:fill="FFFFFF"/>
+          </w:tcPr>
+          <w:p>
+            <w:pPr>
+              <w:spacing w:after="0"/>
+            </w:pPr>
+            <w:r>
+              <w:rPr>
+                <w:sz w:val="20"/>
+              </w:rPr>
+              <w:t>Required names</w:t>
+            </w:r>
+          </w:p>
+        </w:tc>
+        <w:tc>
+          <w:tcPr>
+            <w:tcW w:type="dxa" w:w="3312"/>
+            <w:vAlign w:val="center"/>
+            <w:tcMar>
+              <w:top w:w="80" w:type="dxa"/>
+              <w:left w:w="80" w:type="dxa"/>
+              <w:bottom w:w="80" w:type="dxa"/>
+              <w:right w:w="80" w:type="dxa"/>
+            </w:tcMar>
+            <w:shd w:fill="FFFFFF"/>
+          </w:tcPr>
+          <w:p>
+            <w:pPr>
+              <w:spacing w:after="0"/>
+            </w:pPr>
+            <w:r>
+              <w:rPr>
+                <w:sz w:val="20"/>
+              </w:rPr>
+              <w:t>Submit both names empty</w:t>
+            </w:r>
+          </w:p>
+        </w:tc>
+        <w:tc>
+          <w:tcPr>
+            <w:tcW w:type="dxa" w:w="4968"/>
+            <w:vAlign w:val="center"/>
+            <w:tcMar>
+              <w:top w:w="80" w:type="dxa"/>
+              <w:left w:w="80" w:type="dxa"/>
+              <w:bottom w:w="80" w:type="dxa"/>
+              <w:right w:w="80" w:type="dxa"/>
+            </w:tcMar>
+            <w:shd w:fill="FFFFFF"/>
+          </w:tcPr>
+          <w:p>
+            <w:pPr>
+              <w:spacing w:after="0"/>
+            </w:pPr>
+            <w:r>
+              <w:rPr>
+                <w:sz w:val="20"/>
+              </w:rPr>
+              <w:t>First name and family name errors; no attendance</w:t>
+            </w:r>
+          </w:p>
+        </w:tc>
+      </w:tr>
+      <w:tr>
+        <w:trPr>
+          <w:cantSplit/>
+        </w:trPr>
+        <w:tc>
+          <w:tcPr>
+            <w:tcW w:type="dxa" w:w="1800"/>
+            <w:vAlign w:val="center"/>
+            <w:tcMar>
+              <w:top w:w="80" w:type="dxa"/>
+              <w:left w:w="80" w:type="dxa"/>
+              <w:bottom w:w="80" w:type="dxa"/>
+              <w:right w:w="80" w:type="dxa"/>
+            </w:tcMar>
+            <w:shd w:fill="F2F5F8"/>
+          </w:tcPr>
+          <w:p>
+            <w:pPr>
+              <w:spacing w:after="0"/>
+            </w:pPr>
+            <w:r>
+              <w:rPr>
+                <w:sz w:val="20"/>
+              </w:rPr>
+              <w:t>Unknown name</w:t>
+            </w:r>
+          </w:p>
+        </w:tc>
+        <w:tc>
+          <w:tcPr>
+            <w:tcW w:type="dxa" w:w="3312"/>
+            <w:vAlign w:val="center"/>
+            <w:tcMar>
+              <w:top w:w="80" w:type="dxa"/>
+              <w:left w:w="80" w:type="dxa"/>
+              <w:bottom w:w="80" w:type="dxa"/>
+              <w:right w:w="80" w:type="dxa"/>
+            </w:tcMar>
+            <w:shd w:fill="F2F5F8"/>
+          </w:tcPr>
+          <w:p>
+            <w:pPr>
+              <w:spacing w:after="0"/>
+            </w:pPr>
+            <w:r>
+              <w:rPr>
+                <w:sz w:val="20"/>
+              </w:rPr>
+              <w:t>Submit a unique name absent from Learners</w:t>
+            </w:r>
+          </w:p>
+        </w:tc>
+        <w:tc>
+          <w:tcPr>
+            <w:tcW w:type="dxa" w:w="4968"/>
+            <w:vAlign w:val="center"/>
+            <w:tcMar>
+              <w:top w:w="80" w:type="dxa"/>
+              <w:left w:w="80" w:type="dxa"/>
+              <w:bottom w:w="80" w:type="dxa"/>
+              <w:right w:w="80" w:type="dxa"/>
+            </w:tcMar>
+            <w:shd w:fill="F2F5F8"/>
+          </w:tcPr>
+          <w:p>
+            <w:pPr>
+              <w:spacing w:after="0"/>
+            </w:pPr>
+            <w:r>
+              <w:rPr>
+                <w:sz w:val="20"/>
+              </w:rPr>
+              <w:t>We could not find that name. Please ask the teacher; no attendance</w:t>
+            </w:r>
+          </w:p>
+        </w:tc>
+      </w:tr>
+      <w:tr>
+        <w:trPr>
+          <w:cantSplit/>
+        </w:trPr>
+        <w:tc>
+          <w:tcPr>
+            <w:tcW w:type="dxa" w:w="1800"/>
+            <w:vAlign w:val="center"/>
+            <w:tcMar>
+              <w:top w:w="80" w:type="dxa"/>
+              <w:left w:w="80" w:type="dxa"/>
+              <w:bottom w:w="80" w:type="dxa"/>
+              <w:right w:w="80" w:type="dxa"/>
+            </w:tcMar>
+            <w:shd w:fill="FFFFFF"/>
+          </w:tcPr>
+          <w:p>
+            <w:pPr>
+              <w:spacing w:after="0"/>
+            </w:pPr>
+            <w:r>
+              <w:rPr>
+                <w:sz w:val="20"/>
+              </w:rPr>
+              <w:t>Duplicate sign-in</w:t>
+            </w:r>
+          </w:p>
+        </w:tc>
+        <w:tc>
+          <w:tcPr>
+            <w:tcW w:type="dxa" w:w="3312"/>
+            <w:vAlign w:val="center"/>
+            <w:tcMar>
+              <w:top w:w="80" w:type="dxa"/>
+              <w:left w:w="80" w:type="dxa"/>
+              <w:bottom w:w="80" w:type="dxa"/>
+              <w:right w:w="80" w:type="dxa"/>
+            </w:tcMar>
+            <w:shd w:fill="FFFFFF"/>
+          </w:tcPr>
+          <w:p>
+            <w:pPr>
+              <w:spacing w:after="0"/>
+            </w:pPr>
+            <w:r>
+              <w:rPr>
+                <w:sz w:val="20"/>
+              </w:rPr>
+              <w:t>Submit a learner already signed in</w:t>
+            </w:r>
+          </w:p>
+        </w:tc>
+        <w:tc>
+          <w:tcPr>
+            <w:tcW w:type="dxa" w:w="4968"/>
+            <w:vAlign w:val="center"/>
+            <w:tcMar>
+              <w:top w:w="80" w:type="dxa"/>
+              <w:left w:w="80" w:type="dxa"/>
+              <w:bottom w:w="80" w:type="dxa"/>
+              <w:right w:w="80" w:type="dxa"/>
+            </w:tcMar>
+            <w:shd w:fill="FFFFFF"/>
+          </w:tcPr>
+          <w:p>
+            <w:pPr>
+              <w:spacing w:after="0"/>
+            </w:pPr>
+            <w:r>
+              <w:rPr>
+                <w:sz w:val="20"/>
+              </w:rPr>
+              <w:t>Already signed in; no second attendance and no count increase</w:t>
+            </w:r>
+          </w:p>
+        </w:tc>
+      </w:tr>
+      <w:tr>
+        <w:trPr>
+          <w:cantSplit/>
+        </w:trPr>
+        <w:tc>
+          <w:tcPr>
+            <w:tcW w:type="dxa" w:w="1800"/>
+            <w:vAlign w:val="center"/>
+            <w:tcMar>
+              <w:top w:w="80" w:type="dxa"/>
+              <w:left w:w="80" w:type="dxa"/>
+              <w:bottom w:w="80" w:type="dxa"/>
+              <w:right w:w="80" w:type="dxa"/>
+            </w:tcMar>
+            <w:shd w:fill="F2F5F8"/>
+          </w:tcPr>
+          <w:p>
+            <w:pPr>
+              <w:spacing w:after="0"/>
+            </w:pPr>
+            <w:r>
+              <w:rPr>
+                <w:sz w:val="20"/>
+              </w:rPr>
+              <w:t>Closed code</w:t>
+            </w:r>
+          </w:p>
+        </w:tc>
+        <w:tc>
+          <w:tcPr>
+            <w:tcW w:type="dxa" w:w="3312"/>
+            <w:vAlign w:val="center"/>
+            <w:tcMar>
+              <w:top w:w="80" w:type="dxa"/>
+              <w:left w:w="80" w:type="dxa"/>
+              <w:bottom w:w="80" w:type="dxa"/>
+              <w:right w:w="80" w:type="dxa"/>
+            </w:tcMar>
+            <w:shd w:fill="F2F5F8"/>
+          </w:tcPr>
+          <w:p>
+            <w:pPr>
+              <w:spacing w:after="0"/>
+            </w:pPr>
+            <w:r>
+              <w:rPr>
+                <w:sz w:val="20"/>
+              </w:rPr>
+              <w:t>Reload the saved link after Close check-in</w:t>
+            </w:r>
+          </w:p>
+        </w:tc>
+        <w:tc>
+          <w:tcPr>
+            <w:tcW w:type="dxa" w:w="4968"/>
+            <w:vAlign w:val="center"/>
+            <w:tcMar>
+              <w:top w:w="80" w:type="dxa"/>
+              <w:left w:w="80" w:type="dxa"/>
+              <w:bottom w:w="80" w:type="dxa"/>
+              <w:right w:w="80" w:type="dxa"/>
+            </w:tcMar>
+            <w:shd w:fill="F2F5F8"/>
+          </w:tcPr>
+          <w:p>
+            <w:pPr>
+              <w:spacing w:after="0"/>
+            </w:pPr>
+            <w:r>
+              <w:rPr>
+                <w:sz w:val="20"/>
+              </w:rPr>
+              <w:t>Closed message; no new attendance</w:t>
+            </w:r>
+          </w:p>
+        </w:tc>
+      </w:tr>
+      <w:tr>
+        <w:trPr>
+          <w:cantSplit/>
+        </w:trPr>
+        <w:tc>
+          <w:tcPr>
+            <w:tcW w:type="dxa" w:w="1800"/>
+            <w:vAlign w:val="center"/>
+            <w:tcMar>
+              <w:top w:w="80" w:type="dxa"/>
+              <w:left w:w="80" w:type="dxa"/>
+              <w:bottom w:w="80" w:type="dxa"/>
+              <w:right w:w="80" w:type="dxa"/>
+            </w:tcMar>
+            <w:shd w:fill="FFFFFF"/>
+          </w:tcPr>
+          <w:p>
+            <w:pPr>
+              <w:spacing w:after="0"/>
+            </w:pPr>
+            <w:r>
+              <w:rPr>
+                <w:sz w:val="20"/>
+              </w:rPr>
+              <w:t>No material grant</w:t>
+            </w:r>
+          </w:p>
+        </w:tc>
+        <w:tc>
+          <w:tcPr>
+            <w:tcW w:type="dxa" w:w="3312"/>
+            <w:vAlign w:val="center"/>
+            <w:tcMar>
+              <w:top w:w="80" w:type="dxa"/>
+              <w:left w:w="80" w:type="dxa"/>
+              <w:bottom w:w="80" w:type="dxa"/>
+              <w:right w:w="80" w:type="dxa"/>
+            </w:tcMar>
+            <w:shd w:fill="FFFFFF"/>
+          </w:tcPr>
+          <w:p>
+            <w:pPr>
+              <w:spacing w:after="0"/>
+            </w:pPr>
+            <w:r>
+              <w:rPr>
+                <w:sz w:val="20"/>
+              </w:rPr>
+              <w:t>Open /materials in a separate unsigned-in browser</w:t>
+            </w:r>
+          </w:p>
+        </w:tc>
+        <w:tc>
+          <w:tcPr>
+            <w:tcW w:type="dxa" w:w="4968"/>
+            <w:vAlign w:val="center"/>
+            <w:tcMar>
+              <w:top w:w="80" w:type="dxa"/>
+              <w:left w:w="80" w:type="dxa"/>
+              <w:bottom w:w="80" w:type="dxa"/>
+              <w:right w:w="80" w:type="dxa"/>
+            </w:tcMar>
+            <w:shd w:fill="FFFFFF"/>
+          </w:tcPr>
+          <w:p>
+            <w:pPr>
+              <w:spacing w:after="0"/>
+            </w:pPr>
+            <w:r>
+              <w:rPr>
+                <w:sz w:val="20"/>
+              </w:rPr>
+              <w:t>No filenames or files; asks for QR sign-in</w:t>
+            </w:r>
+          </w:p>
+        </w:tc>
+      </w:tr>
+      <w:tr>
+        <w:trPr>
+          <w:cantSplit/>
+        </w:trPr>
+        <w:tc>
+          <w:tcPr>
+            <w:tcW w:type="dxa" w:w="1800"/>
+            <w:vAlign w:val="center"/>
+            <w:tcMar>
+              <w:top w:w="80" w:type="dxa"/>
+              <w:left w:w="80" w:type="dxa"/>
+              <w:bottom w:w="80" w:type="dxa"/>
+              <w:right w:w="80" w:type="dxa"/>
+            </w:tcMar>
+            <w:shd w:fill="F2F5F8"/>
+          </w:tcPr>
+          <w:p>
+            <w:pPr>
+              <w:spacing w:after="0"/>
+            </w:pPr>
+            <w:r>
+              <w:rPr>
+                <w:sz w:val="20"/>
+              </w:rPr>
+              <w:t>Private file</w:t>
+            </w:r>
+          </w:p>
+        </w:tc>
+        <w:tc>
+          <w:tcPr>
+            <w:tcW w:type="dxa" w:w="3312"/>
+            <w:vAlign w:val="center"/>
+            <w:tcMar>
+              <w:top w:w="80" w:type="dxa"/>
+              <w:left w:w="80" w:type="dxa"/>
+              <w:bottom w:w="80" w:type="dxa"/>
+              <w:right w:w="80" w:type="dxa"/>
+            </w:tcMar>
+            <w:shd w:fill="F2F5F8"/>
+          </w:tcPr>
+          <w:p>
+            <w:pPr>
+              <w:spacing w:after="0"/>
+            </w:pPr>
+            <w:r>
+              <w:rPr>
+                <w:sz w:val="20"/>
+              </w:rPr>
+              <w:t>Link a lesson with one shared file and one staff-only file; sign in a fresh learner</w:t>
+            </w:r>
+          </w:p>
+        </w:tc>
+        <w:tc>
+          <w:tcPr>
+            <w:tcW w:type="dxa" w:w="4968"/>
+            <w:vAlign w:val="center"/>
+            <w:tcMar>
+              <w:top w:w="80" w:type="dxa"/>
+              <w:left w:w="80" w:type="dxa"/>
+              <w:bottom w:w="80" w:type="dxa"/>
+              <w:right w:w="80" w:type="dxa"/>
+            </w:tcMar>
+            <w:shd w:fill="F2F5F8"/>
+          </w:tcPr>
+          <w:p>
+            <w:pPr>
+              <w:spacing w:after="0"/>
+            </w:pPr>
+            <w:r>
+              <w:rPr>
+                <w:sz w:val="20"/>
+              </w:rPr>
+              <w:t>Only the shared file appears</w:t>
+            </w:r>
+          </w:p>
+        </w:tc>
+      </w:tr>
+      <w:tr>
+        <w:trPr>
+          <w:cantSplit/>
+        </w:trPr>
+        <w:tc>
+          <w:tcPr>
+            <w:tcW w:type="dxa" w:w="1800"/>
+            <w:vAlign w:val="center"/>
+            <w:tcMar>
+              <w:top w:w="80" w:type="dxa"/>
+              <w:left w:w="80" w:type="dxa"/>
+              <w:bottom w:w="80" w:type="dxa"/>
+              <w:right w:w="80" w:type="dxa"/>
+            </w:tcMar>
+            <w:shd w:fill="FFFFFF"/>
+          </w:tcPr>
+          <w:p>
+            <w:pPr>
+              <w:spacing w:after="0"/>
+            </w:pPr>
+            <w:r>
+              <w:rPr>
+                <w:sz w:val="20"/>
+              </w:rPr>
+              <w:t>No lesson</w:t>
+            </w:r>
+          </w:p>
+        </w:tc>
+        <w:tc>
+          <w:tcPr>
+            <w:tcW w:type="dxa" w:w="3312"/>
+            <w:vAlign w:val="center"/>
+            <w:tcMar>
+              <w:top w:w="80" w:type="dxa"/>
+              <w:left w:w="80" w:type="dxa"/>
+              <w:bottom w:w="80" w:type="dxa"/>
+              <w:right w:w="80" w:type="dxa"/>
+            </w:tcMar>
+            <w:shd w:fill="FFFFFF"/>
+          </w:tcPr>
+          <w:p>
+            <w:pPr>
+              <w:spacing w:after="0"/>
+            </w:pPr>
+            <w:r>
+              <w:rPr>
+                <w:sz w:val="20"/>
+              </w:rPr>
+              <w:t>Unlink the lesson, then sign in a fresh learner</w:t>
+            </w:r>
+          </w:p>
+        </w:tc>
+        <w:tc>
+          <w:tcPr>
+            <w:tcW w:type="dxa" w:w="4968"/>
+            <w:vAlign w:val="center"/>
+            <w:tcMar>
+              <w:top w:w="80" w:type="dxa"/>
+              <w:left w:w="80" w:type="dxa"/>
+              <w:bottom w:w="80" w:type="dxa"/>
+              <w:right w:w="80" w:type="dxa"/>
+            </w:tcMar>
+            <w:shd w:fill="FFFFFF"/>
+          </w:tcPr>
+          <w:p>
+            <w:pPr>
+              <w:spacing w:after="0"/>
+            </w:pPr>
+            <w:r>
+              <w:rPr>
+                <w:sz w:val="20"/>
+              </w:rPr>
+              <w:t>Attendance succeeds; No materials for today</w:t>
+            </w:r>
+          </w:p>
+        </w:tc>
+      </w:tr>
+      <w:tr>
+        <w:trPr>
+          <w:cantSplit/>
+        </w:trPr>
+        <w:tc>
+          <w:tcPr>
+            <w:tcW w:type="dxa" w:w="1800"/>
+            <w:vAlign w:val="center"/>
+            <w:tcMar>
+              <w:top w:w="80" w:type="dxa"/>
+              <w:left w:w="80" w:type="dxa"/>
+              <w:bottom w:w="80" w:type="dxa"/>
+              <w:right w:w="80" w:type="dxa"/>
+            </w:tcMar>
+            <w:shd w:fill="F2F5F8"/>
+          </w:tcPr>
+          <w:p>
+            <w:pPr>
+              <w:spacing w:after="0"/>
+            </w:pPr>
+            <w:r>
+              <w:rPr>
+                <w:sz w:val="20"/>
+              </w:rPr>
+              <w:t>Pending review</w:t>
+            </w:r>
+          </w:p>
+        </w:tc>
+        <w:tc>
+          <w:tcPr>
+            <w:tcW w:type="dxa" w:w="3312"/>
+            <w:vAlign w:val="center"/>
+            <w:tcMar>
+              <w:top w:w="80" w:type="dxa"/>
+              <w:left w:w="80" w:type="dxa"/>
+              <w:bottom w:w="80" w:type="dxa"/>
+              <w:right w:w="80" w:type="dxa"/>
+            </w:tcMar>
+            <w:shd w:fill="F2F5F8"/>
+          </w:tcPr>
+          <w:p>
+            <w:pPr>
+              <w:spacing w:after="0"/>
+            </w:pPr>
+            <w:r>
+              <w:rPr>
+                <w:sz w:val="20"/>
+              </w:rPr>
+              <w:t>Link a flagged, unreviewed lesson with a shared file; sign in a fresh learner</w:t>
+            </w:r>
+          </w:p>
+        </w:tc>
+        <w:tc>
+          <w:tcPr>
+            <w:tcW w:type="dxa" w:w="4968"/>
+            <w:vAlign w:val="center"/>
+            <w:tcMar>
+              <w:top w:w="80" w:type="dxa"/>
+              <w:left w:w="80" w:type="dxa"/>
+              <w:bottom w:w="80" w:type="dxa"/>
+              <w:right w:w="80" w:type="dxa"/>
+            </w:tcMar>
+            <w:shd w:fill="F2F5F8"/>
+          </w:tcPr>
+          <w:p>
+            <w:pPr>
+              <w:spacing w:after="0"/>
+            </w:pPr>
+            <w:r>
+              <w:rPr>
+                <w:sz w:val="20"/>
+              </w:rPr>
+              <w:t>Attendance succeeds; Materials will be added soon; no files</w:t>
+            </w:r>
+          </w:p>
+        </w:tc>
+      </w:tr>
+      <w:tr>
+        <w:trPr>
+          <w:cantSplit/>
+        </w:trPr>
+        <w:tc>
+          <w:tcPr>
+            <w:tcW w:type="dxa" w:w="1800"/>
+            <w:vAlign w:val="center"/>
+            <w:tcMar>
+              <w:top w:w="80" w:type="dxa"/>
+              <w:left w:w="80" w:type="dxa"/>
+              <w:bottom w:w="80" w:type="dxa"/>
+              <w:right w:w="80" w:type="dxa"/>
+            </w:tcMar>
+            <w:shd w:fill="FFFFFF"/>
+          </w:tcPr>
+          <w:p>
+            <w:pPr>
+              <w:spacing w:after="0"/>
+            </w:pPr>
+            <w:r>
+              <w:rPr>
+                <w:sz w:val="20"/>
+              </w:rPr>
+              <w:t>Existing grant after closure</w:t>
+            </w:r>
+          </w:p>
+        </w:tc>
+        <w:tc>
+          <w:tcPr>
+            <w:tcW w:type="dxa" w:w="3312"/>
+            <w:vAlign w:val="center"/>
+            <w:tcMar>
+              <w:top w:w="80" w:type="dxa"/>
+              <w:left w:w="80" w:type="dxa"/>
+              <w:bottom w:w="80" w:type="dxa"/>
+              <w:right w:w="80" w:type="dxa"/>
+            </w:tcMar>
+            <w:shd w:fill="FFFFFF"/>
+          </w:tcPr>
+          <w:p>
+            <w:pPr>
+              <w:spacing w:after="0"/>
+            </w:pPr>
+            <w:r>
+              <w:rPr>
+                <w:sz w:val="20"/>
+              </w:rPr>
+              <w:t>Close check-in after a successful QR sign-in and revisit /materials on the same browser</w:t>
+            </w:r>
+          </w:p>
+        </w:tc>
+        <w:tc>
+          <w:tcPr>
+            <w:tcW w:type="dxa" w:w="4968"/>
+            <w:vAlign w:val="center"/>
+            <w:tcMar>
+              <w:top w:w="80" w:type="dxa"/>
+              <w:left w:w="80" w:type="dxa"/>
+              <w:bottom w:w="80" w:type="dxa"/>
+              <w:right w:w="80" w:type="dxa"/>
+            </w:tcMar>
+            <w:shd w:fill="FFFFFF"/>
+          </w:tcPr>
+          <w:p>
+            <w:pPr>
+              <w:spacing w:after="0"/>
+            </w:pPr>
+            <w:r>
+              <w:rPr>
+                <w:sz w:val="20"/>
+              </w:rPr>
+              <w:t>Files remain accessible during the 24-hour grant</w:t>
+            </w:r>
+          </w:p>
+        </w:tc>
+      </w:tr>
+    </w:tbl>
+    <w:p>
+      <w:pPr>
+        <w:spacing w:after="0"/>
+      </w:pPr>
+    </w:p>
+    <w:p>
+      <w:r>
+        <w:t>For a manually marked learner, a repeated QR attempt can show Already signed in without issuing a materials grant. This is a current limitation, not proof that material access works. Use a new learner for the successful scan/download case, and ask staff for a handout when that limitation occurs.</w:t>
+      </w:r>
+    </w:p>
+    <w:p>
+      <w:r>
+        <w:t>The four-hour code limit, club-midnight cutoff, 24-hour grant expiry and wrong-name throttle need separate timed or automated tests. Do not change a shared server's clock to simulate expiry. Follow the QR, sign-in and materials test scripts in docs/system_test and the isolated Docker testing instructions in the README.</w:t>
+      </w:r>
+    </w:p>
+    <w:p>
+      <w:r>
+        <w:t>For each run, record the date, commit, browser/phone, test learner, starting and ending counts, case result, and any sanitized screenshot or defect reference. Do not mark a case Pass until its actual result matches the expected result. Avoid repeating the whole walkthrough with the same already-signed-in learner; reuse today's session with a fresh unique learner instead.</w:t>
       </w:r>
     </w:p>
     <w:p>
@@ -6357,7 +7433,7 @@
               <w:rPr>
                 <w:sz w:val="20"/>
               </w:rPr>
-              <w:t>7.2 and 7.4</w:t>
+              <w:t>7.2, 7.4 and 7.7–7.8</w:t>
             </w:r>
           </w:p>
         </w:tc>
@@ -6410,7 +7486,7 @@
               <w:rPr>
                 <w:sz w:val="20"/>
               </w:rPr>
-              <w:t>7.3 and 7.6</w:t>
+              <w:t>7.3 and 7.6–7.8</w:t>
             </w:r>
           </w:p>
         </w:tc>
@@ -6463,7 +7539,7 @@
               <w:rPr>
                 <w:sz w:val="20"/>
               </w:rPr>
-              <w:t>7.1 and 7.5</w:t>
+              <w:t>7.1, 7.5 and 7.7–7.8</w:t>
             </w:r>
           </w:p>
         </w:tc>

</xml_diff>

<commit_message>
feat: add global feedback form with configurable SMTP notifications
Add public feedback entry points, validated mail submission, recipient and SMTP settings, regression tests, and user documentation.
</commit_message>
<xml_diff>
--- a/docs/manual/Ako_User_Manual.docx
+++ b/docs/manual/Ako_User_Manual.docx
@@ -12,7 +12,7 @@
     </w:p>
     <w:p>
       <w:r>
-        <w:t>Version 1.1 | 27 October 2026 | English</w:t>
+        <w:t>Version 1.2 | 27 October 2026 | English</w:t>
       </w:r>
     </w:p>
     <w:p>
@@ -243,6 +243,23 @@
             <w:u w:val="single"/>
           </w:rPr>
           <w:t>Feature coverage</w:t>
+        </w:r>
+      </w:hyperlink>
+    </w:p>
+    <w:p>
+      <w:pPr>
+        <w:ind w:left="288" w:hanging="288"/>
+      </w:pPr>
+      <w:r>
+        <w:t xml:space="preserve">12. </w:t>
+      </w:r>
+      <w:hyperlink w:anchor="ako_c8f0d5848c41275b">
+        <w:r>
+          <w:rPr>
+            <w:color w:val="1F4E79"/>
+            <w:u w:val="single"/>
+          </w:rPr>
+          <w:t>Send feedback</w:t>
         </w:r>
       </w:hyperlink>
     </w:p>
@@ -7767,6 +7784,108 @@
         <w:t>The workflow references are the repository's MSE800 User Stories and Ako Requirements Specification in docs/system_analysis, together with the implemented page controls and service rules. Installation, testing and maintainer procedures are kept in the project README so this manual can focus on user tasks.</w:t>
       </w:r>
     </w:p>
+    <w:p>
+      <w:bookmarkStart w:id="13" w:name="ako_c8f0d5848c41275b"/>
+      <w:pPr>
+        <w:pStyle w:val="Heading1"/>
+      </w:pPr>
+      <w:r>
+        <w:t>12 Send feedback</w:t>
+      </w:r>
+      <w:bookmarkEnd w:id="13"/>
+    </w:p>
+    <w:p>
+      <w:r>
+        <w:rPr>
+          <w:b/>
+        </w:rPr>
+        <w:t>Role:</w:t>
+      </w:r>
+      <w:r>
+        <w:t xml:space="preserve"> Anyone, including visitors and learners without an account. </w:t>
+      </w:r>
+      <w:r>
+        <w:rPr>
+          <w:b/>
+        </w:rPr>
+        <w:t>Entry:</w:t>
+      </w:r>
+      <w:r>
+        <w:t xml:space="preserve"> The speech-bubble </w:t>
+      </w:r>
+      <w:r>
+        <w:rPr>
+          <w:b/>
+        </w:rPr>
+        <w:t>Send feedback</w:t>
+      </w:r>
+      <w:r>
+        <w:t xml:space="preserve"> icon at the bottom-right of every page.</w:t>
+      </w:r>
+    </w:p>
+    <w:p>
+      <w:pPr>
+        <w:ind w:left="288" w:hanging="288"/>
+      </w:pPr>
+      <w:r>
+        <w:t>1. Click or tap the feedback icon. The Feedback page opens.</w:t>
+      </w:r>
+    </w:p>
+    <w:p>
+      <w:pPr>
+        <w:ind w:left="288" w:hanging="288"/>
+      </w:pPr>
+      <w:r>
+        <w:t>2. Enter a Title describing the problem or suggestion, up to 200 characters.</w:t>
+      </w:r>
+    </w:p>
+    <w:p>
+      <w:pPr>
+        <w:ind w:left="288" w:hanging="288"/>
+      </w:pPr>
+      <w:r>
+        <w:t>3. Enter your valid Email address so staff can reply.</w:t>
+      </w:r>
+    </w:p>
+    <w:p>
+      <w:pPr>
+        <w:ind w:left="288" w:hanging="288"/>
+      </w:pPr>
+      <w:r>
+        <w:t>4. Enter a Description, up to 5,000 characters.</w:t>
+      </w:r>
+    </w:p>
+    <w:p>
+      <w:pPr>
+        <w:ind w:left="288" w:hanging="288"/>
+      </w:pPr>
+      <w:r>
+        <w:t>5. Choose Submit feedback once and wait for the result.</w:t>
+      </w:r>
+    </w:p>
+    <w:p>
+      <w:pPr>
+        <w:ind w:left="288" w:hanging="288"/>
+      </w:pPr>
+      <w:r>
+        <w:t>6. Check for Thank you. Your feedback has been submitted.</w:t>
+      </w:r>
+    </w:p>
+    <w:p>
+      <w:r>
+        <w:t>All fields are required. Do not include passwords or private learner information. The form keeps your text after validation or delivery errors and clears it after a confirmed submission. The submit button is disabled while the request is pending. You can reach the icon with the keyboard and press Enter. It is hidden when printing.</w:t>
+      </w:r>
+    </w:p>
+    <w:p>
+      <w:r>
+        <w:t>If feedback is temporarily unavailable, ask the maintainer to check email settings. For too many requests, wait before trying again. A delivery error does not always mean no recipient received the message; avoid repeatedly submitting the same text.</w:t>
+      </w:r>
+    </w:p>
+    <w:p>
+      <w:r>
+        <w:t>The receiving addresses are configured by the maintainer in server/.env and may include several addresses separated by semicolons. Visitors cannot change that list. Successful submission means the mail server accepted the message; final inbox delivery and staff reply times depend on the receiving mail service and staff. There is no feedback history page or automatic email sent to the visitor.</w:t>
+      </w:r>
+    </w:p>
     <w:sectPr>
       <w:footerReference w:type="default" r:id="rId9"/>
       <w:pgSz w:w="12240" w:h="15840"/>

</xml_diff>